<commit_message>
docs: freeze R7 BIZ-1 V2 design baseline
</commit_message>
<xml_diff>
--- a/docs/01-项目需求规格说明书_V1.0.docx
+++ b/docs/01-项目需求规格说明书_V1.0.docx
@@ -2,6 +2,247 @@
 <file path=word/document.xml><?xml version="1.0" encoding="utf-8"?>
 <w:document xmlns:wpc="http://schemas.microsoft.com/office/word/2010/wordprocessingCanvas" xmlns:mo="http://schemas.microsoft.com/office/mac/office/2008/main" xmlns:mc="http://schemas.openxmlformats.org/markup-compatibility/2006" xmlns:mv="urn:schemas-microsoft-com:mac:vml" xmlns:o="urn:schemas-microsoft-com:office:office" xmlns:r="http://schemas.openxmlformats.org/officeDocument/2006/relationships" xmlns:m="http://schemas.openxmlformats.org/officeDocument/2006/math" xmlns:v="urn:schemas-microsoft-com:vml" xmlns:wp14="http://schemas.microsoft.com/office/word/2010/wordprocessingDrawing" xmlns:wp="http://schemas.openxmlformats.org/drawingml/2006/wordprocessingDrawing" xmlns:w10="urn:schemas-microsoft-com:office:word" xmlns:w="http://schemas.openxmlformats.org/wordprocessingml/2006/main" xmlns:w14="http://schemas.microsoft.com/office/word/2010/wordml" xmlns:wpg="http://schemas.microsoft.com/office/word/2010/wordprocessingGroup" xmlns:wpi="http://schemas.microsoft.com/office/word/2010/wordprocessingInk" xmlns:wne="http://schemas.microsoft.com/office/word/2006/wordml" xmlns:wps="http://schemas.microsoft.com/office/word/2010/wordprocessingShape" mc:Ignorable="w14 wp14">
   <w:body>
+    <w:p>
+      <w:pPr>
+        <w:pStyle w:val="Heading1"/>
+      </w:pPr>
+      <w:r>
+        <w:rPr>
+          <w:rFonts w:ascii="Microsoft YaHei" w:hAnsi="Microsoft YaHei" w:eastAsia="Microsoft YaHei"/>
+          <w:b w:val="0"/>
+          <w:sz w:val="21"/>
+        </w:rPr>
+        <w:t>V2 目标基线修订</w:t>
+      </w:r>
+    </w:p>
+    <w:p>
+      <w:r>
+        <w:rPr>
+          <w:rFonts w:ascii="Microsoft YaHei" w:hAnsi="Microsoft YaHei" w:eastAsia="Microsoft YaHei"/>
+          <w:b/>
+          <w:sz w:val="21"/>
+        </w:rPr>
+        <w:t>本修订依据 docs/15-R7-BIZ-1-V2-评审决策冻结记录.md，描述 BIZ-1A～1D 后续实施的目标规则。当前数据库和已上线 API 未在 BIZ-1P 阶段改变。本文原 V1.0 正文中与本修订或冻结记录冲突的断言已废弃，仅保留现行实现与历史追溯意义。</w:t>
+      </w:r>
+    </w:p>
+    <w:p>
+      <w:r>
+        <w:rPr>
+          <w:rFonts w:ascii="Microsoft YaHei" w:hAnsi="Microsoft YaHei" w:eastAsia="Microsoft YaHei"/>
+          <w:b/>
+          <w:sz w:val="21"/>
+        </w:rPr>
+        <w:t>目标设计和完整测试条目见 docs/16-R7-BIZ-1P-V2-目标设计与验收基线.md。出现冻结记录内部冲突必须停止实施并标记 DECISION REQUIRED。</w:t>
+      </w:r>
+    </w:p>
+    <w:p>
+      <w:pPr>
+        <w:pStyle w:val="ListBullet"/>
+      </w:pPr>
+      <w:r>
+        <w:rPr>
+          <w:rFonts w:ascii="Microsoft YaHei" w:hAnsi="Microsoft YaHei" w:eastAsia="Microsoft YaHei"/>
+          <w:b w:val="0"/>
+          <w:sz w:val="21"/>
+        </w:rPr>
+        <w:t>Driver.driverType 是 INTERNAL/OUTSOURCED 的唯一业务来源，不能从 Role、绑定、工资或线路反推。DRIVER Role 只表示系统账号身份。系统管理不得创建或分配 DRIVER；司机业务流程创建或关联 User，并管控司机类型变更时的绑定、未完线路、工资和历史。</w:t>
+      </w:r>
+    </w:p>
+    <w:p>
+      <w:pPr>
+        <w:pStyle w:val="ListBullet"/>
+      </w:pPr>
+      <w:r>
+        <w:rPr>
+          <w:rFonts w:ascii="Microsoft YaHei" w:hAnsi="Microsoft YaHei" w:eastAsia="Microsoft YaHei"/>
+          <w:b w:val="0"/>
+          <w:sz w:val="21"/>
+        </w:rPr>
+        <w:t>INTERNAL 使用公司 vehicle 和司机车辆绑定，发布、发车按既有公司车辆规则校验。OUTSOURCED 不绑定公司车辆，不创建 vehicle/FK，不要求 vehicleId；外协车牌仅是每条线路参与事实，不校验公司车辆存在、归属、保险、绑定或状态。</w:t>
+      </w:r>
+    </w:p>
+    <w:p>
+      <w:pPr>
+        <w:pStyle w:val="ListBullet"/>
+      </w:pPr>
+      <w:r>
+        <w:rPr>
+          <w:rFonts w:ascii="Microsoft YaHei" w:hAnsi="Microsoft YaHei" w:eastAsia="Microsoft YaHei"/>
+          <w:b w:val="0"/>
+          <w:sz w:val="21"/>
+        </w:rPr>
+        <w:t>Route 有 N 条有序 Participant。每条记录保存司机及类型事实、INTERNAL 公司车或 OUTSOURCED 车牌、INITIAL/TRANSFER、指派/发车/结束时间、结束方式、转派原因和当前核定工资；任何一次转派不得覆盖前一参与事实。</w:t>
+      </w:r>
+    </w:p>
+    <w:p>
+      <w:pPr>
+        <w:pStyle w:val="ListBullet"/>
+      </w:pPr>
+      <w:r>
+        <w:rPr>
+          <w:rFonts w:ascii="Microsoft YaHei" w:hAnsi="Microsoft YaHei" w:eastAsia="Microsoft YaHei"/>
+          <w:b w:val="0"/>
+          <w:sz w:val="21"/>
+        </w:rPr>
+        <w:t>初始司机即第一参与，初始工资即第一参与工资；外协初始发布必须有真实外协车牌及工资。普通未执行初始指派取消后，其工资和车辆费用资格不计入有效口径，历史仍保留。首次转派后，未发车再次换人也只能继续转派。转派封存上一参与、创建新当前参与，新司机重新发车；转派过程中不得作废，最终必须由当前司机卸货。</w:t>
+      </w:r>
+    </w:p>
+    <w:p>
+      <w:pPr>
+        <w:pStyle w:val="ListBullet"/>
+      </w:pPr>
+      <w:r>
+        <w:rPr>
+          <w:rFonts w:ascii="Microsoft YaHei" w:hAnsi="Microsoft YaHei" w:eastAsia="Microsoft YaHei"/>
+          <w:b w:val="0"/>
+          <w:sz w:val="21"/>
+        </w:rPr>
+        <w:t>转派权限可在该动作中重核所有既有参与工资、填新司机工资、以原因留痕；工资可为 0.00，只有金额变化才记调整历史。非转派工资修改需要独立权限和原因。线路有效工资是所有纳入有效参与口径的当前核定工资之和。</w:t>
+      </w:r>
+    </w:p>
+    <w:p>
+      <w:pPr>
+        <w:pStyle w:val="ListBullet"/>
+      </w:pPr>
+      <w:r>
+        <w:rPr>
+          <w:rFonts w:ascii="Microsoft YaHei" w:hAnsi="Microsoft YaHei" w:eastAsia="Microsoft YaHei"/>
+          <w:b w:val="0"/>
+          <w:sz w:val="21"/>
+        </w:rPr>
+        <w:t>所有正式 INTERNAL 参与公司车辆均具备该线路费用资格，和是否已点击发车、工资是否为零无关；外协车牌无公司线路费用资格。能源费用使用整条线路首次发车至最终卸货窗口，0/多匹配不猜，唯一匹配才自动归属。所有正式费用在授权下可重新归属，前后线路、操作人、时间、原因永久保留。</w:t>
+      </w:r>
+    </w:p>
+    <w:p>
+      <w:pPr>
+        <w:pStyle w:val="ListBullet"/>
+      </w:pPr>
+      <w:r>
+        <w:rPr>
+          <w:rFonts w:ascii="Microsoft YaHei" w:hAnsi="Microsoft YaHei" w:eastAsia="Microsoft YaHei"/>
+          <w:b w:val="0"/>
+          <w:sz w:val="21"/>
+        </w:rPr>
+        <w:t>公司费用事实与线路归属分离。未归属有效费用不计单线路支出，但必须计入公司总支出；重新归属只改变线路间分布，不改变公司总费用。线路费用与日常费用仍按各自业务归属，日常费用不分摊线路。</w:t>
+      </w:r>
+    </w:p>
+    <w:p>
+      <w:pPr>
+        <w:pStyle w:val="ListBullet"/>
+      </w:pPr>
+      <w:r>
+        <w:rPr>
+          <w:rFonts w:ascii="Microsoft YaHei" w:hAnsi="Microsoft YaHei" w:eastAsia="Microsoft YaHei"/>
+          <w:b w:val="0"/>
+          <w:sz w:val="21"/>
+        </w:rPr>
+        <w:t>只有当前有效参与司机可最终卸货，且必须有当前参与司机/车辆及至少一张合法磅单。磅单进入正式 Attachment 并绑定原始卸货/重量事实；后续重量纠错不覆盖原图。毛重必须大于皮重，净重系统计算，不达标仍允许卸货。</w:t>
+      </w:r>
+    </w:p>
+    <w:p>
+      <w:pPr>
+        <w:pStyle w:val="ListBullet"/>
+      </w:pPr>
+      <w:r>
+        <w:rPr>
+          <w:rFonts w:ascii="Microsoft YaHei" w:hAnsi="Microsoft YaHei" w:eastAsia="Microsoft YaHei"/>
+          <w:b w:val="0"/>
+          <w:sz w:val="21"/>
+        </w:rPr>
+        <w:t>INTERNAL 达标为 TRUE/FALSE，OUTSOURCED 为 NULL/不适用；达标率分母仅含适用线路。司机线路列表/详情 API 不返回单价、任何参与工资、收入、利润、达标或阈值；本人正式工资单由 salary:mine 提供。</w:t>
+      </w:r>
+    </w:p>
+    <w:p>
+      <w:pPr>
+        <w:pStyle w:val="ListBullet"/>
+      </w:pPr>
+      <w:r>
+        <w:rPr>
+          <w:rFonts w:ascii="Microsoft YaHei" w:hAnsi="Microsoft YaHei" w:eastAsia="Microsoft YaHei"/>
+          <w:b w:val="0"/>
+          <w:sz w:val="21"/>
+        </w:rPr>
+        <w:t>只有 COMPLETED 线路可作废，原因必填，UI 明确告知经营影响并要求勾选确认。作废后该线路收入、工资、归属线路费用和利润不再计入当前有效线路经营；全部事实和公司真实发生费用仍保留，公司总费用不因作废消失。VOIDED 恢复固定回 COMPLETED。</w:t>
+      </w:r>
+    </w:p>
+    <w:p>
+      <w:pPr>
+        <w:pStyle w:val="ListBullet"/>
+      </w:pPr>
+      <w:r>
+        <w:rPr>
+          <w:rFonts w:ascii="Microsoft YaHei" w:hAnsi="Microsoft YaHei" w:eastAsia="Microsoft YaHei"/>
+          <w:b w:val="0"/>
+          <w:sz w:val="21"/>
+        </w:rPr>
+        <w:t>线路导入区分新线路导入与上线前已完成历史线路导入。历史导入带 HISTORICAL_IMPORT 来源、ImportTask/Row 追溯，进入 COMPLETED 历史经营与月结；不得再发布、发车、转派、卸货。历史模板待真实文件提供，不臆造字段。</w:t>
+      </w:r>
+    </w:p>
+    <w:p>
+      <w:pPr>
+        <w:pStyle w:val="ListBullet"/>
+      </w:pPr>
+      <w:r>
+        <w:rPr>
+          <w:rFonts w:ascii="Microsoft YaHei" w:hAnsi="Microsoft YaHei" w:eastAsia="Microsoft YaHei"/>
+          <w:b w:val="0"/>
+          <w:sz w:val="21"/>
+        </w:rPr>
+        <w:t>已完成线路列表显示净重、达标/不适用、收入、总支出、利润；详情展示参与、转派、重量、原始磅单、工资与调整历史、正式费用及来源、支出构成和状态操作历史。金额按经营/财务权限控制。</w:t>
+      </w:r>
+    </w:p>
+    <w:p>
+      <w:pPr>
+        <w:pStyle w:val="ListBullet"/>
+      </w:pPr>
+      <w:r>
+        <w:rPr>
+          <w:rFonts w:ascii="Microsoft YaHei" w:hAnsi="Microsoft YaHei" w:eastAsia="Microsoft YaHei"/>
+          <w:b w:val="0"/>
+          <w:sz w:val="21"/>
+        </w:rPr>
+        <w:t>月结旧快照永久不变，新版本说明工资、重量、费用新增/冲销与归属、线路作废/恢复的前后事实和金额影响；审批费用摘要只需发起日期、类型、金额、发起人、最终通过人、通过时间。</w:t>
+      </w:r>
+    </w:p>
+    <w:p>
+      <w:pPr>
+        <w:pStyle w:val="ListBullet"/>
+      </w:pPr>
+      <w:r>
+        <w:rPr>
+          <w:rFonts w:ascii="Microsoft YaHei" w:hAnsi="Microsoft YaHei" w:eastAsia="Microsoft YaHei"/>
+          <w:b w:val="0"/>
+          <w:sz w:val="21"/>
+        </w:rPr>
+        <w:t>“打回指定节点”正式改称“打回指定步骤”：目标是冻结流程的稳定 Step/Node ID；只有当前实例实际合法前置步骤可返回时显示；同岗位/审批人重复需显示第 N 步，禁止用户手填序号，动作历史不可覆盖。</w:t>
+      </w:r>
+    </w:p>
+    <w:p>
+      <w:pPr>
+        <w:pStyle w:val="ListBullet"/>
+      </w:pPr>
+      <w:r>
+        <w:rPr>
+          <w:rFonts w:ascii="Microsoft YaHei" w:hAnsi="Microsoft YaHei" w:eastAsia="Microsoft YaHei"/>
+          <w:b w:val="0"/>
+          <w:sz w:val="21"/>
+        </w:rPr>
+        <w:t>audit_log 目前只有查询能力。BIZ-1A 必须建立写入底座，后续记录转派、工资、作废/恢复、费用归属、重量和角色权限等高风险变化，专项历史表继续保留。</w:t>
+      </w:r>
+    </w:p>
+    <w:p>
+      <w:pPr>
+        <w:pStyle w:val="Heading2"/>
+      </w:pPr>
+      <w:r>
+        <w:rPr>
+          <w:rFonts w:ascii="Microsoft YaHei" w:hAnsi="Microsoft YaHei" w:eastAsia="Microsoft YaHei"/>
+          <w:b w:val="0"/>
+          <w:sz w:val="21"/>
+        </w:rPr>
+        <w:t>以下为 V1.0 原始正文。与以上 V2 修订冲突的旧口径均已废弃。</w:t>
+      </w:r>
+    </w:p>
     <w:p>
       <w:pPr>
         <w:jc w:val="center"/>

</xml_diff>

<commit_message>
feat: establish route participant foundation
</commit_message>
<xml_diff>
--- a/docs/01-项目需求规格说明书_V1.0.docx
+++ b/docs/01-项目需求规格说明书_V1.0.docx
@@ -228,6 +228,24 @@
           <w:sz w:val="21"/>
         </w:rPr>
         <w:t>audit_log 目前只有查询能力。BIZ-1A 必须建立写入底座，后续记录转派、工资、作废/恢复、费用归属、重量和角色权限等高风险变化，专项历史表继续保留。</w:t>
+      </w:r>
+    </w:p>
+    <w:p>
+      <w:pPr>
+        <w:pStyle w:val="ListBullet"/>
+        <w:keepLines/>
+      </w:pPr>
+      <w:r>
+        <w:t>BIZ-1A 验收补充：后台人员从“基础资料 → 司机”创建司机时，手机号无合法 DRIVER User 则由创建人填写初始密码并创建安全哈希账号；已有合法 DRIVER User 只关联，不改原密码。密码不明文返回、不进入 Audit 或日志，密码重置仍走现有正式流程。BIZ-1A 仅完成服务底座，页面/API 接入不在本阶段冒充已实现。</w:t>
+      </w:r>
+    </w:p>
+    <w:p>
+      <w:pPr>
+        <w:pStyle w:val="ListBullet"/>
+        <w:keepLines/>
+      </w:pPr>
+      <w:r>
+        <w:t>OUTSOURCED 初始线路必须填写真实外协车牌及初始线路工资，工资允许 0.00；不要求 vehicleId，不查询或创建公司 vehicle，不建立车辆绑定。后端依据 Driver.driverType 选择 INTERNAL/OUTSOURCED 分支，不以客户端声明的类型为准。正式首发布入口留后续阶段实施。</w:t>
       </w:r>
     </w:p>
     <w:p>

</xml_diff>